<commit_message>
Integrate Yandex cache, city route search and offline regional map
</commit_message>
<xml_diff>
--- a/Милин_ШАД_311_Отчет_Курсовая_Kotlin.docx
+++ b/Милин_ШАД_311_Отчет_Курсовая_Kotlin.docx
@@ -630,6 +630,7 @@
         <w:tabs>
           <w:tab w:pos="9354" w:val="right" w:leader="dot"/>
         </w:tabs>
+        <w:spacing w:after="60"/>
         <w:ind w:firstLine="0" w:left="0"/>
       </w:pPr>
       <w:r>
@@ -644,6 +645,7 @@
         <w:tabs>
           <w:tab w:pos="9354" w:val="right" w:leader="dot"/>
         </w:tabs>
+        <w:spacing w:after="60"/>
         <w:ind w:firstLine="0" w:left="0"/>
       </w:pPr>
       <w:r>
@@ -658,6 +660,7 @@
         <w:tabs>
           <w:tab w:pos="9354" w:val="right" w:leader="dot"/>
         </w:tabs>
+        <w:spacing w:after="60"/>
         <w:ind w:firstLine="0" w:left="283"/>
       </w:pPr>
       <w:r>
@@ -672,6 +675,7 @@
         <w:tabs>
           <w:tab w:pos="9354" w:val="right" w:leader="dot"/>
         </w:tabs>
+        <w:spacing w:after="60"/>
         <w:ind w:firstLine="0" w:left="283"/>
       </w:pPr>
       <w:r>
@@ -686,6 +690,7 @@
         <w:tabs>
           <w:tab w:pos="9354" w:val="right" w:leader="dot"/>
         </w:tabs>
+        <w:spacing w:after="60"/>
         <w:ind w:firstLine="0" w:left="283"/>
       </w:pPr>
       <w:r>
@@ -700,6 +705,7 @@
         <w:tabs>
           <w:tab w:pos="9354" w:val="right" w:leader="dot"/>
         </w:tabs>
+        <w:spacing w:after="60"/>
         <w:ind w:firstLine="0" w:left="283"/>
       </w:pPr>
       <w:r>
@@ -714,6 +720,7 @@
         <w:tabs>
           <w:tab w:pos="9354" w:val="right" w:leader="dot"/>
         </w:tabs>
+        <w:spacing w:after="60"/>
         <w:ind w:firstLine="0" w:left="0"/>
       </w:pPr>
       <w:r>
@@ -728,6 +735,7 @@
         <w:tabs>
           <w:tab w:pos="9354" w:val="right" w:leader="dot"/>
         </w:tabs>
+        <w:spacing w:after="60"/>
         <w:ind w:firstLine="0" w:left="283"/>
       </w:pPr>
       <w:r>
@@ -742,6 +750,7 @@
         <w:tabs>
           <w:tab w:pos="9354" w:val="right" w:leader="dot"/>
         </w:tabs>
+        <w:spacing w:after="60"/>
         <w:ind w:firstLine="0" w:left="283"/>
       </w:pPr>
       <w:r>
@@ -756,6 +765,7 @@
         <w:tabs>
           <w:tab w:pos="9354" w:val="right" w:leader="dot"/>
         </w:tabs>
+        <w:spacing w:after="60"/>
         <w:ind w:firstLine="0" w:left="283"/>
       </w:pPr>
       <w:r>
@@ -770,6 +780,7 @@
         <w:tabs>
           <w:tab w:pos="9354" w:val="right" w:leader="dot"/>
         </w:tabs>
+        <w:spacing w:after="60"/>
         <w:ind w:firstLine="0" w:left="0"/>
       </w:pPr>
       <w:r>
@@ -784,6 +795,7 @@
         <w:tabs>
           <w:tab w:pos="9354" w:val="right" w:leader="dot"/>
         </w:tabs>
+        <w:spacing w:after="60"/>
         <w:ind w:firstLine="0" w:left="283"/>
       </w:pPr>
       <w:r>
@@ -798,6 +810,7 @@
         <w:tabs>
           <w:tab w:pos="9354" w:val="right" w:leader="dot"/>
         </w:tabs>
+        <w:spacing w:after="60"/>
         <w:ind w:firstLine="0" w:left="283"/>
       </w:pPr>
       <w:r>
@@ -812,6 +825,7 @@
         <w:tabs>
           <w:tab w:pos="9354" w:val="right" w:leader="dot"/>
         </w:tabs>
+        <w:spacing w:after="60"/>
         <w:ind w:firstLine="0" w:left="283"/>
       </w:pPr>
       <w:r>
@@ -826,6 +840,7 @@
         <w:tabs>
           <w:tab w:pos="9354" w:val="right" w:leader="dot"/>
         </w:tabs>
+        <w:spacing w:after="60"/>
         <w:ind w:firstLine="0" w:left="0"/>
       </w:pPr>
       <w:r>
@@ -840,6 +855,7 @@
         <w:tabs>
           <w:tab w:pos="9354" w:val="right" w:leader="dot"/>
         </w:tabs>
+        <w:spacing w:after="60"/>
         <w:ind w:firstLine="0" w:left="283"/>
       </w:pPr>
       <w:r>
@@ -854,6 +870,7 @@
         <w:tabs>
           <w:tab w:pos="9354" w:val="right" w:leader="dot"/>
         </w:tabs>
+        <w:spacing w:after="60"/>
         <w:ind w:firstLine="0" w:left="283"/>
       </w:pPr>
       <w:r>
@@ -868,6 +885,7 @@
         <w:tabs>
           <w:tab w:pos="9354" w:val="right" w:leader="dot"/>
         </w:tabs>
+        <w:spacing w:after="60"/>
         <w:ind w:firstLine="0" w:left="0"/>
       </w:pPr>
       <w:r>
@@ -882,6 +900,7 @@
         <w:tabs>
           <w:tab w:pos="9354" w:val="right" w:leader="dot"/>
         </w:tabs>
+        <w:spacing w:after="60"/>
         <w:ind w:firstLine="0" w:left="0"/>
       </w:pPr>
       <w:r>
@@ -896,6 +915,7 @@
         <w:tabs>
           <w:tab w:pos="9354" w:val="right" w:leader="dot"/>
         </w:tabs>
+        <w:spacing w:after="60"/>
         <w:ind w:firstLine="0" w:left="0"/>
       </w:pPr>
       <w:r>
@@ -910,6 +930,7 @@
         <w:tabs>
           <w:tab w:pos="9354" w:val="right" w:leader="dot"/>
         </w:tabs>
+        <w:spacing w:after="60"/>
         <w:ind w:firstLine="0" w:left="0"/>
       </w:pPr>
       <w:r>
@@ -924,6 +945,7 @@
         <w:tabs>
           <w:tab w:pos="9354" w:val="right" w:leader="dot"/>
         </w:tabs>
+        <w:spacing w:after="60"/>
         <w:ind w:firstLine="0" w:left="0"/>
       </w:pPr>
       <w:r>
@@ -938,6 +960,7 @@
         <w:tabs>
           <w:tab w:pos="9354" w:val="right" w:leader="dot"/>
         </w:tabs>
+        <w:spacing w:after="60"/>
         <w:ind w:firstLine="0" w:left="0"/>
       </w:pPr>
       <w:r>
@@ -952,6 +975,7 @@
         <w:tabs>
           <w:tab w:pos="9354" w:val="right" w:leader="dot"/>
         </w:tabs>
+        <w:spacing w:after="60"/>
         <w:ind w:firstLine="0" w:left="0"/>
       </w:pPr>
       <w:r>
@@ -966,6 +990,7 @@
         <w:tabs>
           <w:tab w:pos="9354" w:val="right" w:leader="dot"/>
         </w:tabs>
+        <w:spacing w:after="60"/>
         <w:ind w:firstLine="0" w:left="0"/>
       </w:pPr>
       <w:r>
@@ -980,6 +1005,7 @@
         <w:tabs>
           <w:tab w:pos="9354" w:val="right" w:leader="dot"/>
         </w:tabs>
+        <w:spacing w:after="60"/>
         <w:ind w:firstLine="0" w:left="0"/>
       </w:pPr>
       <w:r>
@@ -990,6 +1016,21 @@
     </w:p>
     <w:p>
       <w:pPr>
+        <w:pStyle w:val="CourseRef"/>
+        <w:tabs>
+          <w:tab w:pos="9354" w:val="right" w:leader="dot"/>
+        </w:tabs>
+        <w:spacing w:after="60"/>
+        <w:ind w:firstLine="0" w:left="0"/>
+      </w:pPr>
+      <w:r>
+        <w:t>ПРИЛОЖЕНИЕ Ж Загрузка и интеграция расписаний</w:t>
+        <w:tab/>
+        <w:t>88</w:t>
+      </w:r>
+    </w:p>
+    <w:p>
+      <w:pPr>
         <w:pStyle w:val="CourseH1"/>
         <w:pageBreakBefore/>
         <w:jc w:val="center"/>
@@ -1031,7 +1072,7 @@
         <w:jc w:val="both"/>
       </w:pPr>
       <w:r>
-        <w:t>Для достижения цели необходимо изучить транспортные источники и существующие приложения, сформулировать проверяемые требования, спроектировать интерфейс и структуру данных, выбрать метод поиска, реализовать приложение и подтвердить его работу unit- и UI-тестами. Отдельной задачей является проверка действительного покрытия базы: поддержка всех регионов в программе не означает наличия расписания каждого направления.</w:t>
+        <w:t>Основной текст и приложения А–Е фиксируют этап 12–13 сентября. Изменения от 15–16 сентября приведены в приложении Ж и имеют приоритет. Исторические листинги сохраняют указанную границу коммита; актуальные исходники находятся в электронном проекте.</w:t>
       </w:r>
     </w:p>
     <w:p>
@@ -13367,6 +13408,208 @@
       </w:pPr>
       <w:r>
         <w:t xml:space="preserve">    Сохранить задание и первоначальный план курсовой</w:t>
+      </w:r>
+    </w:p>
+    <w:p>
+      <w:pPr>
+        <w:pStyle w:val="CourseH1"/>
+        <w:pageBreakBefore/>
+        <w:jc w:val="center"/>
+      </w:pPr>
+      <w:r>
+        <w:t>ПРИЛОЖЕНИЕ Ж</w:t>
+        <w:br/>
+        <w:t>Загрузка и интеграция расписаний 15 сентября 2026 года</w:t>
+      </w:r>
+    </w:p>
+    <w:p>
+      <w:pPr>
+        <w:pStyle w:val="CourseH1"/>
+        <w:pageBreakBefore w:val="0"/>
+        <w:jc w:val="center"/>
+      </w:pPr>
+      <w:r>
+        <w:t>Ж.1 Согласованная сеть и получение данных</w:t>
+      </w:r>
+    </w:p>
+    <w:p>
+      <w:pPr>
+        <w:pStyle w:val="CourseBody"/>
+        <w:pageBreakBefore w:val="0"/>
+        <w:jc w:val="both"/>
+      </w:pPr>
+      <w:r>
+        <w:t>Полное покрытие России заменено согласованной ограниченной сетью: Москва, Московская, Владимирская и Нижегородская области. Выбраны по четыре пары поездов, электричек и автобусов. Полные сети регионов и наличие билетов не заявляются. Фактический список запросов сохранён в data/yandex/network-plan.json.</w:t>
+      </w:r>
+    </w:p>
+    <w:p>
+      <w:pPr>
+        <w:pStyle w:val="CourseBody"/>
+        <w:pageBreakBefore w:val="0"/>
+        <w:jc w:val="both"/>
+      </w:pPr>
+      <w:r>
+        <w:t>Период поездок — 21–28 сентября включительно. Получены 192 ответа за восемь дат и 24 ответа за предыдущую дату для проверки ночной границы. API иногда возвращает ночные отправления соседней даты; сохраняется фактическая дата рейса, а не дата запроса. Основная загрузка потребовала 190 новых запросов и два ответа из кэша; пограничная — 24. Всего на этом этапе 214 новых запросов, вместе с прежними попытками — 243 за текущие 24 часа при пределе 250 из доступных 500.</w:t>
+      </w:r>
+    </w:p>
+    <w:p>
+      <w:pPr>
+        <w:pStyle w:val="CourseBody"/>
+        <w:pageBreakBefore w:val="0"/>
+        <w:jc w:val="both"/>
+      </w:pPr>
+      <w:r>
+        <w:t>В 216 ответах получено 3176 строк. Исключены 353 строки с отправлением вне выбранного периода и 139 повторных строк. Проверены контрольные суммы, страницы, станции, координаты, смещения времени, длительности и согласованность частей одного рейса. Недостающие времена не выдумывались. Источник: API Яндекс Расписаний, метод search, https://yandex.ru/dev/rasp/doc/ru/reference/schedule-point-point (дата обращения: 15.09.2026).</w:t>
+      </w:r>
+    </w:p>
+    <w:p>
+      <w:pPr>
+        <w:pStyle w:val="CourseH1"/>
+        <w:pageBreakBefore/>
+        <w:jc w:val="center"/>
+      </w:pPr>
+      <w:r>
+        <w:t>Ж.2 Хранение и изменения приложения</w:t>
+      </w:r>
+    </w:p>
+    <w:p>
+      <w:pPr>
+        <w:pStyle w:val="CourseBody"/>
+        <w:pageBreakBefore w:val="0"/>
+        <w:jc w:val="both"/>
+      </w:pPr>
+      <w:r>
+        <w:t>Подготовлены 1787 экземпляров рейсов на конкретные даты: 797 автобусных, 612 электричек и 378 поездов; 18 станций. У 530 рейсов объединены несколько наблюдавшихся участков. Размер нормализованного файла — 1 011 639 байт. Для такого набора выбран JSON во внутреннем каталоге Android; Room и SQLite не требуются по текущим измерениям.</w:t>
+      </w:r>
+    </w:p>
+    <w:p>
+      <w:pPr>
+        <w:pStyle w:val="CourseBody"/>
+        <w:pageBreakBefore w:val="0"/>
+        <w:jc w:val="both"/>
+      </w:pPr>
+      <w:r>
+        <w:t>Файл читается и проверяется вне главного потока. Только после успешной проверки он заменяет прежнюю базу. В основной APK временные ответы и ключ API не включаются; на первом запуске карта доступна, а расписание устанавливается через импорт. Получение и подготовка обновления пока выполняются инструментами на Mac. Прямой сетевой загрузчик в Android ещё не реализован.</w:t>
+      </w:r>
+    </w:p>
+    <w:p>
+      <w:pPr>
+        <w:pStyle w:val="CourseBody"/>
+        <w:pageBreakBefore w:val="0"/>
+        <w:jc w:val="both"/>
+      </w:pPr>
+      <w:r>
+        <w:t>В программе различаются автобус, поезд и электричка. Добавлены запас пересадки 30 минут по умолчанию и выбор 15, 30, 45 или 60 минут с сохранением настройки. Правило конкретной станции имеет приоритет. Запрещены внутригородские участки и автоматические переходы между вокзалами. Известное прибытие после последнего дня набора сохраняется, но новая посадка вне периода не допускается.</w:t>
+      </w:r>
+    </w:p>
+    <w:p>
+      <w:pPr>
+        <w:pStyle w:val="CourseBody"/>
+        <w:pageBreakBefore w:val="0"/>
+        <w:jc w:val="both"/>
+      </w:pPr>
+      <w:r>
+        <w:t>Срок кэша наследует самый ранний срок исходных ответов и справочника: для этого набора — 21 сентября 2026 года, 19:57:34 по Москве. Это срок хранения, а не последняя дата поездки. Истёкший файл отклоняется при импорте, удаляется при загрузке приложения и дополнительно блокируется алгоритмом. Повторная упаковка срок не продлевает; перед более поздней демонстрацией нужен свежий кэш.</w:t>
+      </w:r>
+    </w:p>
+    <w:p>
+      <w:pPr>
+        <w:pStyle w:val="CourseH1"/>
+        <w:pageBreakBefore/>
+        <w:jc w:val="center"/>
+      </w:pPr>
+      <w:r>
+        <w:t>Ж.3 Проверки этапа 15 сентября</w:t>
+      </w:r>
+    </w:p>
+    <w:p>
+      <w:pPr>
+        <w:pStyle w:val="CourseBody"/>
+        <w:pageBreakBefore w:val="0"/>
+        <w:jc w:val="both"/>
+      </w:pPr>
+      <w:r>
+        <w:t>Сборка debug APK и lint выполнены. Все 16 unit-тестов и три инструментальных теста на Android 10 прошли. Восемь локальных проверок инструментов загрузки и нормализации также прошли без обращений к API. Протоколы сохранены в docs/validation/yandex-2026-09-15; аудит источника — yandex-network-audit-2026-09-15.json в родительском каталоге.</w:t>
+      </w:r>
+    </w:p>
+    <w:p>
+      <w:pPr>
+        <w:pStyle w:val="CourseBody"/>
+        <w:pageBreakBefore w:val="0"/>
+        <w:jc w:val="both"/>
+      </w:pPr>
+      <w:r>
+        <w:t>Дополнительно при отключённых Wi-Fi и мобильных данных повторно выполнен тест импорта и интерфейса с реальным набором. Проверены 48 поисков: шесть пар на каждой из восьми дат. Все завершились без достижения лимита состояний. Импорт занял 333 мс, чтение — 248 мс; поиск — 105–201 мс, медиана 122,5 мс. Это измерения на эмуляторе, не гарантия скорости на любом телефоне.</w:t>
+      </w:r>
+    </w:p>
+    <w:p>
+      <w:pPr>
+        <w:pStyle w:val="CourseBody"/>
+        <w:pageBreakBefore w:val="0"/>
+        <w:jc w:val="both"/>
+      </w:pPr>
+      <w:r>
+        <w:t>Пример на 21 сентября: Курский вокзал — Нижний Новгород, варианты 264, 316 и 331 минута, соответственно без пересадки и с одной пересадкой. Орехово-Зуево — Нижний Новгород: 261, 268 и 276 минут, по одной пересадке. Владимир — Суздаль на автобусе: 35, 45 и 45 минут. На других датах меняется часть альтернатив; победа пересадки над прямым рейсом заранее не заявляется.</w:t>
+      </w:r>
+    </w:p>
+    <w:p>
+      <w:pPr>
+        <w:pStyle w:val="CourseBody"/>
+        <w:pageBreakBefore w:val="0"/>
+        <w:jc w:val="both"/>
+      </w:pPr>
+      <w:r>
+        <w:t>Ограничение источника: автобусов Владимир — Нижний Новгород в прямом направлении API не вернул ни на одну из восьми дат, хотя обратные рейсы присутствуют. Пропуск не заменяется выдуманным расписанием. Следующие работы: развитие обновления непосредственно в Android, итоговая синхронизация основного текста, UML, скриншотов и полных листингов приложений А–Е с новым этапом. Их историческая граница 6344357 не выдаётся за текущую версию кода.</w:t>
+      </w:r>
+    </w:p>
+    <w:p>
+      <w:pPr>
+        <w:pStyle w:val="CourseH1"/>
+        <w:pageBreakBefore/>
+        <w:jc w:val="center"/>
+      </w:pPr>
+      <w:r>
+        <w:t>Ж.4 Поиск по городам и карта 16 сентября</w:t>
+      </w:r>
+    </w:p>
+    <w:p>
+      <w:pPr>
+        <w:pStyle w:val="CourseBody"/>
+        <w:pageBreakBefore w:val="0"/>
+        <w:jc w:val="both"/>
+      </w:pPr>
+      <w:r>
+        <w:t>Дата теперь задаёт начало окна отправлений. При выборе 21 сентября и стандартных восьми дней рассматриваются отправления 21–28 сентября, включая 25-е. Длительность считается от первой посадки до прибытия, без ожидания первого рейса. Дата отправления показана в карточке результата.</w:t>
+      </w:r>
+    </w:p>
+    <w:p>
+      <w:pPr>
+        <w:pStyle w:val="CourseBody"/>
+        <w:pageBreakBefore w:val="0"/>
+        <w:jc w:val="both"/>
+      </w:pPr>
+      <w:r>
+        <w:t>Выбираются города: Москва и Владимир — по пять станций, Нижний Новгород — четыре, Суздаль — две, Орехово-Зуево и Петушки — по одной. Городские сведения получены из сохранённого справочника без новых запросов. Все станции города участвуют как начало или конец пути. Города одной области не объединяются; пересадки остаются только на одной физической станции.</w:t>
+      </w:r>
+    </w:p>
+    <w:p>
+      <w:pPr>
+        <w:pStyle w:val="CourseBody"/>
+        <w:pageBreakBefore w:val="0"/>
+        <w:jc w:val="both"/>
+      </w:pPr>
+      <w:r>
+        <w:t>Алгоритм выполняет один поиск для множеств начальных и конечных станций. Частичный путь, уже медленнее третьего полного результата, не продолжается. Отсечение устранило выявленное исчерпание памяти. Окончательная проверка: 19 unit-тестов, три Android-теста без интернета и восемь Python-проверок. Среди проверок интерфейса — отправление 15 сентября при выбранной начальной дате 11 сентября. Реальная база проверена в 56 расчётах; протокол — docs/validation/cities-2026-09-16.</w:t>
+      </w:r>
+    </w:p>
+    <w:p>
+      <w:pPr>
+        <w:pStyle w:val="CourseBody"/>
+        <w:pageBreakBefore w:val="0"/>
+        <w:jc w:val="both"/>
+      </w:pPr>
+      <w:r>
+        <w:t>Офлайн-карта дополнена региональными полигонами Natural Earth Admin 1 с русскими подписями. При открытии видны загруженные города, доступны масштабирование, перемещение и обзор России. Дополнительный слой занимает 888 877 байт. Источник: https://www.naturalearthdata.com/downloads/10m-cultural-vectors/10m-admin-1-states-provinces/ (дата обращения: 16.09.2026), public domain. Контрольные суммы и обработка указаны в data/map/regions-provenance.json. Линии маршрута обозначают связи станций, а не точную трассу транспорта.</w:t>
       </w:r>
     </w:p>
     <w:sectPr>

</xml_diff>